<commit_message>
Final changes and new binary
</commit_message>
<xml_diff>
--- a/forum_ar_2024/beyond_unnecessary_self/beyond_unnecesary_self_FINAL.docx
+++ b/forum_ar_2024/beyond_unnecessary_self/beyond_unnecesary_self_FINAL.docx
@@ -398,6 +398,11 @@
     <w:p>
       <w:pPr>
         <w:pStyle w:val="BodyText"/>
+        <w:rPr>
+          <w:rStyle w:val="Emphasis"/>
+          <w:i w:val="0"/>
+          <w:iCs w:val="0"/>
+        </w:rPr>
       </w:pPr>
       <w:r>
         <w:t xml:space="preserve">In a wider scope of contemporary technologies, the rate at which the development in general is progressing can turn technological and software objects sometimes less than a decade old incompatible with current systems, which makes working with these modules even more interesting. What are the properties, or uses, of the Dataton that have been </w:t>
@@ -406,130 +411,7 @@
         <w:lastRenderedPageBreak/>
         <w:t>concealed by the quick development of contemporary music technology? They did go out of production and disappeared from the main stream music technology market. An experimental hypothesis is that by learning from these early instruments, learning about the particularities of the interface, will alter the disposition of my self in relation to the instruments. This could potentially also illuminate new dimensions of the complex nature of improvisation in electronic music in general.</w:t>
       </w:r>
-    </w:p>
-    <w:p>
-      <w:pPr>
-        <w:pStyle w:val="CaptionedFigure"/>
-      </w:pPr>
       <w:bookmarkStart w:id="5" w:name="fig:dataton_1"/>
-      <w:r>
-        <w:rPr>
-          <w:noProof/>
-        </w:rPr>
-        <w:drawing>
-          <wp:inline distT="0" distB="0" distL="0" distR="0" wp14:anchorId="593DC355" wp14:editId="317B7F41">
-            <wp:extent cx="5334000" cy="5334000"/>
-            <wp:effectExtent l="0" t="0" r="0" b="0"/>
-            <wp:docPr id="27" name="Picture"/>
-            <wp:cNvGraphicFramePr/>
-            <a:graphic xmlns:a="http://schemas.openxmlformats.org/drawingml/2006/main">
-              <a:graphicData uri="http://schemas.openxmlformats.org/drawingml/2006/picture">
-                <pic:pic xmlns:pic="http://schemas.openxmlformats.org/drawingml/2006/picture">
-                  <pic:nvPicPr>
-                    <pic:cNvPr id="28" name="Picture" descr="file:///Volumes/Freedom/Dropbox/org/seminar-slides/kmh/stanford/img/DATATON-01.JPG"/>
-                    <pic:cNvPicPr>
-                      <a:picLocks noChangeAspect="1" noChangeArrowheads="1"/>
-                    </pic:cNvPicPr>
-                  </pic:nvPicPr>
-                  <pic:blipFill>
-                    <a:blip r:embed="rId7"/>
-                    <a:stretch>
-                      <a:fillRect/>
-                    </a:stretch>
-                  </pic:blipFill>
-                  <pic:spPr bwMode="auto">
-                    <a:xfrm>
-                      <a:off x="0" y="0"/>
-                      <a:ext cx="5334000" cy="5334000"/>
-                    </a:xfrm>
-                    <a:prstGeom prst="rect">
-                      <a:avLst/>
-                    </a:prstGeom>
-                    <a:noFill/>
-                    <a:ln w="9525">
-                      <a:noFill/>
-                      <a:headEnd/>
-                      <a:tailEnd/>
-                    </a:ln>
-                  </pic:spPr>
-                </pic:pic>
-              </a:graphicData>
-            </a:graphic>
-          </wp:inline>
-        </w:drawing>
-      </w:r>
-    </w:p>
-    <w:p>
-      <w:pPr>
-        <w:pStyle w:val="Caption"/>
-        <w:rPr>
-          <w:rStyle w:val="Emphasis"/>
-          <w:i/>
-          <w:iCs w:val="0"/>
-        </w:rPr>
-      </w:pPr>
-      <w:r>
-        <w:rPr>
-          <w:rStyle w:val="Emphasis"/>
-          <w:i/>
-          <w:iCs w:val="0"/>
-        </w:rPr>
-        <w:t xml:space="preserve">Figure 1: </w:t>
-      </w:r>
-      <w:r>
-        <w:rPr>
-          <w:rStyle w:val="Emphasis"/>
-          <w:i/>
-          <w:iCs w:val="0"/>
-        </w:rPr>
-        <w:t xml:space="preserve">Six of the many </w:t>
-      </w:r>
-      <w:proofErr w:type="spellStart"/>
-      <w:r>
-        <w:rPr>
-          <w:rStyle w:val="Emphasis"/>
-          <w:i/>
-          <w:iCs w:val="0"/>
-        </w:rPr>
-        <w:t>Dataton</w:t>
-      </w:r>
-      <w:proofErr w:type="spellEnd"/>
-      <w:r>
-        <w:rPr>
-          <w:rStyle w:val="Emphasis"/>
-          <w:i/>
-          <w:iCs w:val="0"/>
-        </w:rPr>
-        <w:t xml:space="preserve"> 3000 modules in a picture from </w:t>
-      </w:r>
-      <w:proofErr w:type="spellStart"/>
-      <w:r>
-        <w:rPr>
-          <w:rStyle w:val="Emphasis"/>
-          <w:i/>
-          <w:iCs w:val="0"/>
-        </w:rPr>
-        <w:t>Statens</w:t>
-      </w:r>
-      <w:proofErr w:type="spellEnd"/>
-      <w:r>
-        <w:rPr>
-          <w:rStyle w:val="Emphasis"/>
-          <w:i/>
-          <w:iCs w:val="0"/>
-        </w:rPr>
-        <w:t xml:space="preserve"> </w:t>
-      </w:r>
-      <w:proofErr w:type="spellStart"/>
-      <w:r>
-        <w:rPr>
-          <w:rStyle w:val="Emphasis"/>
-          <w:i/>
-          <w:iCs w:val="0"/>
-        </w:rPr>
-        <w:t>musikverk</w:t>
-      </w:r>
-      <w:proofErr w:type="spellEnd"/>
     </w:p>
     <w:bookmarkEnd w:id="5"/>
     <w:p>
@@ -537,11 +419,7 @@
         <w:pStyle w:val="BodyText"/>
       </w:pPr>
       <w:r>
-        <w:t xml:space="preserve">In an artistic practice that departs from use of obsolete instruments the interrelations between the various subjects and objects involved in the performance can become complicated, but they may also disclose the challenges involved in a fruitful manner. The most prominent is the aspect of technology itself. Though many examples of inventive music technology designs are incorporated into mainstream products, others are simply forgotten and abandoned despite their sometimes explicit contribution to the </w:t>
-      </w:r>
-      <w:r>
-        <w:lastRenderedPageBreak/>
-        <w:t>development. The race for inventing new and even more laborious electronic instruments and interfaces, fueled both by inventiveness, need and by market economy and capitalism, makes artistic practices involving these kinds of instruments fragile and vulnerable to changes that renders all, or parts of the instruments, unusable. This may be software upgrades, abandoned hardware circuits, forgotten system-specific knowledge, or simply the fact that new upgrades are so much more compelling in its usability and sonic or musical qualities that it renders the old instruments obsolete. Traditional acoustic instruments are generally not upgraded in this fashion so this is a particular trait of electronic instruments.</w:t>
+        <w:t>In an artistic practice that departs from use of obsolete instruments the interrelations between the various subjects and objects involved in the performance can become complicated, but they may also disclose the challenges involved in a fruitful manner. The most prominent is the aspect of technology itself. Though many examples of inventive music technology designs are incorporated into mainstream products, others are simply forgotten and abandoned despite their sometimes explicit contribution to the development. The race for inventing new and even more laborious electronic instruments and interfaces, fueled both by inventiveness, need and by market economy and capitalism, makes artistic practices involving these kinds of instruments fragile and vulnerable to changes that renders all, or parts of the instruments, unusable. This may be software upgrades, abandoned hardware circuits, forgotten system-specific knowledge, or simply the fact that new upgrades are so much more compelling in its usability and sonic or musical qualities that it renders the old instruments obsolete. Traditional acoustic instruments are generally not upgraded in this fashion so this is a particular trait of electronic instruments.</w:t>
       </w:r>
     </w:p>
     <w:p>
@@ -590,7 +468,11 @@
         <w:pStyle w:val="BodyText"/>
       </w:pPr>
       <w:r>
-        <w:t xml:space="preserve">There are both differences and similarities between the study of traditional methods for musical interpretation, rooted in Western musical history and practices, and the excavation of the technological and cultural significance of a particular electronic musical instrument of the past. Since at least the romantic era the definition of the artistic work has been constructed from the vantage point of the composer in a strictly hierarchical structure with the self of the originator at the centre. This is well described by the French literary critic and philosopher Roland Barthes in his famous essay </w:t>
+        <w:t xml:space="preserve">There are both differences and similarities between the study of traditional methods for musical interpretation, rooted in Western musical history and practices, and the excavation of the technological and cultural significance of a particular electronic musical instrument of the past. Since at least the romantic era the definition of the artistic work has </w:t>
+      </w:r>
+      <w:r>
+        <w:lastRenderedPageBreak/>
+        <w:t xml:space="preserve">been constructed from the vantage point of the composer in a strictly hierarchical structure with the self of the originator at the centre. This is well described by the French literary critic and philosopher Roland Barthes in his famous essay </w:t>
       </w:r>
       <w:r>
         <w:rPr>
@@ -627,11 +509,7 @@
         <w:t>auteur</w:t>
       </w:r>
       <w:r>
-        <w:t xml:space="preserve"> and their many attributes. This structural organization of the musical work makes it susceptible to commodification, but also, or perhaps even more so, turns the author into a commercial object whose presence in social media defines their value. My distancing, or giving up of, myself is part of my attempt to distance myself from this perspective and instead establish a artistic practice that where the self is in constant motion, where there is no center or origin, only relations. The work concept in this case will also be in constant motion </w:t>
-      </w:r>
-      <w:r>
-        <w:lastRenderedPageBreak/>
-        <w:t>rendering a structural analysis rather meaningless through the amalgamation of the self with the process.</w:t>
+        <w:t xml:space="preserve"> and their many attributes. This structural organization of the musical work makes it susceptible to commodification, but also, or perhaps even more so, turns the author into a commercial object whose presence in social media defines their value. My distancing, or giving up of, myself is part of my attempt to distance myself from this perspective and instead establish a artistic practice that where the self is in constant motion, where there is no center or origin, only relations. The work concept in this case will also be in constant motion rendering a structural analysis rather meaningless through the amalgamation of the self with the process.</w:t>
       </w:r>
     </w:p>
     <w:p>
@@ -749,7 +627,11 @@
         <w:t>reader</w:t>
       </w:r>
       <w:r>
-        <w:t xml:space="preserve"> is an important part of the construction of the understanding of the object in a way that is also related to how Roland Barthes privileges the interpreter rather than the author. Though I believe that this line of thinking is useful in performance there is still a risk of creating hierarchies in the relations between the various actors if the instruments and the interpretation of them are put at the centre in this way. Neither is it my interest to design an artistically driven project where the end goal is a </w:t>
+        <w:t xml:space="preserve"> is an important part of the construction of the understanding of the object in a way that is also related to how Roland Barthes privileges the interpreter rather than the author. Though I believe that this line of thinking is useful in performance there is still a risk of creating hierarchies in the relations between the various actors if the instruments and the interpretation of them are put at the centre in this way. Neither is it my interest to design an artistically driven project where the </w:t>
+      </w:r>
+      <w:r>
+        <w:lastRenderedPageBreak/>
+        <w:t xml:space="preserve">end goal is a </w:t>
       </w:r>
       <w:r>
         <w:rPr>
@@ -774,7 +656,6 @@
         <w:pStyle w:val="BodyText"/>
       </w:pPr>
       <w:r>
-        <w:lastRenderedPageBreak/>
         <w:t xml:space="preserve">To summarize, in the field of music one may imagine two models of analysis emerging from this discussion. The traditional historical and author centered approach, and a historically informed exploration of a electronic music heritage. The first has the work at its origin and the second attempts to understand a performative context that supports a network of relations that also includes an originator, but does not necessarily privilege them. This approach is related to the HIP movement for authentic classical music performance, but our work in the project </w:t>
       </w:r>
       <w:r>
@@ -871,7 +752,11 @@
         </w:r>
       </w:hyperlink>
       <w:r>
-        <w:t>). Tresch and Dolan explore this experimental ethics of instruments through four analytical categories which in essence are adaptations of the four axes that makes up "Foucault’s analysis of the self’s relation to the self". Tresch and Dolan "have tweaked and tuned them in order to apply them to instruments" (</w:t>
+        <w:t xml:space="preserve">). Tresch and Dolan explore this </w:t>
+      </w:r>
+      <w:r>
+        <w:lastRenderedPageBreak/>
+        <w:t>experimental ethics of instruments through four analytical categories which in essence are adaptations of the four axes that makes up "Foucault’s analysis of the self’s relation to the self". Tresch and Dolan "have tweaked and tuned them in order to apply them to instruments" (</w:t>
       </w:r>
       <w:hyperlink w:anchor="citeproc_bib_item_18">
         <w:r>
@@ -902,11 +787,7 @@
         <w:footnoteReference w:id="4"/>
       </w:r>
       <w:r>
-        <w:t xml:space="preserve"> Their idea of an ethics of instruments is leaning on the notion that these categories can provide grounds for an analysis of an ethics of </w:t>
-      </w:r>
-      <w:r>
-        <w:lastRenderedPageBreak/>
-        <w:t xml:space="preserve">instruments such as the </w:t>
+        <w:t xml:space="preserve"> Their idea of an ethics of instruments is leaning on the notion that these categories can provide grounds for an analysis of an ethics of instruments such as the </w:t>
       </w:r>
       <w:proofErr w:type="spellStart"/>
       <w:r>
@@ -1025,6 +906,7 @@
         <w:pStyle w:val="BodyText"/>
       </w:pPr>
       <w:r>
+        <w:lastRenderedPageBreak/>
         <w:t>The care of the self is the care of the activity, in this case the artistic activity, and not the care of the soul-as-substance to use Foucault's terminology.</w:t>
       </w:r>
       <w:r>
@@ -1034,80 +916,80 @@
         <w:footnoteReference w:id="5"/>
       </w:r>
       <w:r>
-        <w:t xml:space="preserve"> The practice, the doing, transcends the self and has priority over it and the principle that uses the tools of artistic practice is in essence the aesthetics of the creative act rather than the self. Hence, I argue that there is a useful relation here between the concept of the soul-as-substance–as well as the general critique of the dominance of the author discussed above–and the ambition to give up the self in artistic practices. It may even be necessary to first give up the self in </w:t>
+        <w:t xml:space="preserve"> The practice, the doing, transcends the self and has priority over it and the principle that uses the tools of artistic practice is in essence the aesthetics of the creative act rather than the self. Hence, I argue that there is a useful relation here between the concept of the soul-as-substance–as well as the general critique of the dominance of the author discussed above–and the ambition to give up the self in artistic practices. It may even be necessary to first give up the self in order to see how the practice may contribute to the necessary freedom. It can appear counter-intuitive at first that giving up the self is a process associated with Foucault's care for the self, but in this reading it is a condition for the self's relation to the self and its freedom. The soul-as-substance here is a domination of the self propelled by capitalism in ways that makes the subject normative rather than one that allows for an engagement of free play: it is a threat to freedom as a necessary condition for improvisation.</w:t>
+      </w:r>
+    </w:p>
+    <w:p>
+      <w:pPr>
+        <w:pStyle w:val="BodyText"/>
+      </w:pPr>
+      <w:r>
+        <w:t xml:space="preserve">Though Thoreau may not have thought of it this way </w:t>
+      </w:r>
+      <w:r>
+        <w:rPr>
+          <w:rStyle w:val="Emphasis"/>
+        </w:rPr>
+        <w:t>the absent speaker</w:t>
+      </w:r>
+      <w:r>
+        <w:t xml:space="preserve"> that was discussed above references the care of the self in odd and interesting ways. Both gives priority to the activity rather than the subject, and the practice is a tool through which the care for the self is developed. The </w:t>
+      </w:r>
+      <w:r>
+        <w:rPr>
+          <w:rStyle w:val="Emphasis"/>
+        </w:rPr>
+        <w:t>giving up of the self</w:t>
+      </w:r>
+      <w:r>
+        <w:t xml:space="preserve"> and the </w:t>
+      </w:r>
+      <w:r>
+        <w:rPr>
+          <w:rStyle w:val="Emphasis"/>
+        </w:rPr>
+        <w:t>care of the self</w:t>
+      </w:r>
+      <w:r>
+        <w:t xml:space="preserve"> are not in opposition as they may first appear to do, instead they feed upon each other. They both allow for an epistemology of creativity and an understanding of practice as the core of human activity more closely aligned with others than the self. The care for the self is the care of the relations to the other and a method for giving up of the self.</w:t>
+      </w:r>
+    </w:p>
+    <w:p>
+      <w:pPr>
+        <w:pStyle w:val="BodyText"/>
+      </w:pPr>
+      <w:r>
+        <w:t>Freedom is the precondition for ethics as well as for improvisation.</w:t>
+      </w:r>
+      <w:r>
+        <w:rPr>
+          <w:rStyle w:val="FootnoteReference"/>
+        </w:rPr>
+        <w:footnoteReference w:id="6"/>
+      </w:r>
+      <w:r>
+        <w:t xml:space="preserve"> This notion appears to open up a possible connection between ethics and improvisation in that both depend on some concept of freedom. This freedom, however, is elusive and may easily be mistaken for the freedom of the self, a freedom rather attached to a popularized notion of self-emancipation and consumer freedom in a capitalist market economy. But if improvisation is to be considered an act of ethics a further paraphrasing of Foucault may read: </w:t>
+      </w:r>
+      <w:r>
+        <w:rPr>
+          <w:rStyle w:val="Emphasis"/>
+        </w:rPr>
+        <w:t>Musical improvisation is one of the considered forms that freedom takes when it is informed by reflection.</w:t>
+      </w:r>
+      <w:r>
+        <w:t xml:space="preserve"> This highlights the importance of the reflective act, necessary in most artistic processes, as the mediator between freedom and improvisation. Reflection, then, is the activity that instantiates a recursive process between freedom and improvisation.</w:t>
+      </w:r>
+    </w:p>
+    <w:p>
+      <w:pPr>
+        <w:pStyle w:val="BodyText"/>
+      </w:pPr>
+      <w:r>
+        <w:t xml:space="preserve">The ethics of improvisation arises from freedom. The condition for this relation to develop is the self's reflection upon itself and upon the practice, but it is mainly the results of this process that are of interest, not the self itself. This can be compared to philosopher Gary Peters' remark that "free-improvisation is not driven by a concern for other improvisers, but </w:t>
       </w:r>
       <w:r>
         <w:lastRenderedPageBreak/>
-        <w:t>order to see how the practice may contribute to the necessary freedom. It can appear counter-intuitive at first that giving up the self is a process associated with Foucault's care for the self, but in this reading it is a condition for the self's relation to the self and its freedom. The soul-as-substance here is a domination of the self propelled by capitalism in ways that makes the subject normative rather than one that allows for an engagement of free play: it is a threat to freedom as a necessary condition for improvisation.</w:t>
-      </w:r>
-    </w:p>
-    <w:p>
-      <w:pPr>
-        <w:pStyle w:val="BodyText"/>
-      </w:pPr>
-      <w:r>
-        <w:t xml:space="preserve">Though Thoreau may not have thought of it this way </w:t>
-      </w:r>
-      <w:r>
-        <w:rPr>
-          <w:rStyle w:val="Emphasis"/>
-        </w:rPr>
-        <w:t>the absent speaker</w:t>
-      </w:r>
-      <w:r>
-        <w:t xml:space="preserve"> that was discussed above references the care of the self in odd and interesting ways. Both gives priority to the activity rather than the subject, and the practice is a tool through which the care for the self is developed. The </w:t>
-      </w:r>
-      <w:r>
-        <w:rPr>
-          <w:rStyle w:val="Emphasis"/>
-        </w:rPr>
-        <w:t>giving up of the self</w:t>
-      </w:r>
-      <w:r>
-        <w:t xml:space="preserve"> and the </w:t>
-      </w:r>
-      <w:r>
-        <w:rPr>
-          <w:rStyle w:val="Emphasis"/>
-        </w:rPr>
-        <w:t>care of the self</w:t>
-      </w:r>
-      <w:r>
-        <w:t xml:space="preserve"> are not in opposition as they may first appear to do, instead they feed upon each other. They both allow for an epistemology of creativity and an understanding of practice as the core of human activity more closely aligned with others than the self. The care for the self is the care of the relations to the other and a method for giving up of the self.</w:t>
-      </w:r>
-    </w:p>
-    <w:p>
-      <w:pPr>
-        <w:pStyle w:val="BodyText"/>
-      </w:pPr>
-      <w:r>
-        <w:t>Freedom is the precondition for ethics as well as for improvisation.</w:t>
-      </w:r>
-      <w:r>
-        <w:rPr>
-          <w:rStyle w:val="FootnoteReference"/>
-        </w:rPr>
-        <w:footnoteReference w:id="6"/>
-      </w:r>
-      <w:r>
-        <w:t xml:space="preserve"> This notion appears to open up a possible connection between ethics and improvisation in that both depend on some concept of freedom. This freedom, however, is elusive and may easily be mistaken for the freedom of the self, a freedom rather attached to a popularized notion of self-emancipation and consumer freedom in a capitalist market economy. But if improvisation is to be considered an act of ethics a further paraphrasing of Foucault may read: </w:t>
-      </w:r>
-      <w:r>
-        <w:rPr>
-          <w:rStyle w:val="Emphasis"/>
-        </w:rPr>
-        <w:t>Musical improvisation is one of the considered forms that freedom takes when it is informed by reflection.</w:t>
-      </w:r>
-      <w:r>
-        <w:t xml:space="preserve"> This highlights the importance of the reflective act, necessary in most artistic processes, as the mediator between freedom and improvisation. Reflection, then, is the activity that instantiates a recursive process between freedom and improvisation.</w:t>
-      </w:r>
-    </w:p>
-    <w:p>
-      <w:pPr>
-        <w:pStyle w:val="BodyText"/>
-      </w:pPr>
-      <w:r>
-        <w:t>The ethics of improvisation arises from freedom. The condition for this relation to develop is the self's reflection upon itself and upon the practice, but it is mainly the results of this process that are of interest, not the self itself. This can be compared to philosopher Gary Peters' remark that "free-improvisation is not driven by a concern for other improvisers, but by a concern or care for the work itself" (</w:t>
+        <w:t>by a concern or care for the work itself" (</w:t>
       </w:r>
       <w:hyperlink w:anchor="citeproc_bib_item_2">
         <w:r>
@@ -1153,11 +1035,7 @@
         <w:pStyle w:val="FirstParagraph"/>
       </w:pPr>
       <w:r>
-        <w:t xml:space="preserve">My argument here has been that with the tools that are defined by Foucault through the technologies of the self, the notion of the care of the self opens up a focus on the relations between the self and self, and the surrounding context. Relations that eventually renders </w:t>
-      </w:r>
-      <w:r>
-        <w:lastRenderedPageBreak/>
-        <w:t>the actual self less important. What can be gathered from Tresch and Dolan is that the self's relation to the self promotes the autonomy of some of these objects. Through the unwrapping of the various discourses of power, also broad</w:t>
+        <w:t>My argument here has been that with the tools that are defined by Foucault through the technologies of the self, the notion of the care of the self opens up a focus on the relations between the self and self, and the surrounding context. Relations that eventually renders the actual self less important. What can be gathered from Tresch and Dolan is that the self's relation to the self promotes the autonomy of some of these objects. Through the unwrapping of the various discourses of power, also broad</w:t>
       </w:r>
       <w:r>
         <w:t>ly</w:t>
@@ -1226,6 +1104,7 @@
       <w:bookmarkStart w:id="8" w:name="acknowledgment"/>
       <w:bookmarkEnd w:id="7"/>
       <w:r>
+        <w:lastRenderedPageBreak/>
         <w:t>Acknowledgment</w:t>
       </w:r>
     </w:p>
@@ -1275,7 +1154,6 @@
       <w:bookmarkStart w:id="11" w:name="citeproc_bib_item_2"/>
       <w:bookmarkEnd w:id="11"/>
       <w:r>
-        <w:lastRenderedPageBreak/>
         <w:t xml:space="preserve">Benson, Bruce Ellis. 2003. </w:t>
       </w:r>
       <w:r>
@@ -1317,10 +1195,7 @@
         <w:t>:</w:t>
       </w:r>
       <w:r>
-        <w:t xml:space="preserve"> </w:t>
-      </w:r>
-      <w:r>
-        <w:t>10.1007/978-3-031-41570-8_3</w:t>
+        <w:t xml:space="preserve"> 10.1007/978-3-031-41570-8_3</w:t>
       </w:r>
       <w:r>
         <w:t>.</w:t>
@@ -1454,59 +1329,45 @@
       <w:bookmarkEnd w:id="19"/>
       <w:r>
         <w:rPr>
-          <w:lang w:val="sv-SE"/>
+          <w:lang w:val="en-GB"/>
         </w:rPr>
         <w:t>Holzer, D</w:t>
       </w:r>
       <w:r>
         <w:rPr>
-          <w:lang w:val="sv-SE"/>
+          <w:lang w:val="en-GB"/>
         </w:rPr>
         <w:t>erek</w:t>
       </w:r>
       <w:r>
         <w:rPr>
-          <w:lang w:val="sv-SE"/>
+          <w:lang w:val="en-GB"/>
         </w:rPr>
         <w:t>, H</w:t>
       </w:r>
       <w:r>
         <w:rPr>
-          <w:lang w:val="sv-SE"/>
+          <w:lang w:val="en-GB"/>
         </w:rPr>
         <w:t>enrik</w:t>
       </w:r>
       <w:r>
         <w:rPr>
-          <w:lang w:val="sv-SE"/>
+          <w:lang w:val="en-GB"/>
         </w:rPr>
         <w:t xml:space="preserve"> Frisk, and A</w:t>
       </w:r>
       <w:r>
         <w:rPr>
-          <w:lang w:val="sv-SE"/>
+          <w:lang w:val="en-GB"/>
         </w:rPr>
         <w:t>ndre</w:t>
       </w:r>
       <w:r>
         <w:rPr>
-          <w:lang w:val="sv-SE"/>
-        </w:rPr>
-        <w:t xml:space="preserve"> </w:t>
-      </w:r>
-      <w:proofErr w:type="spellStart"/>
-      <w:r>
-        <w:rPr>
-          <w:lang w:val="sv-SE"/>
-        </w:rPr>
-        <w:t>Holzapfel</w:t>
-      </w:r>
-      <w:proofErr w:type="spellEnd"/>
-      <w:r>
-        <w:rPr>
-          <w:lang w:val="sv-SE"/>
-        </w:rPr>
-        <w:t xml:space="preserve">. </w:t>
+          <w:lang w:val="en-GB"/>
+        </w:rPr>
+        <w:t xml:space="preserve"> Holzapfel. </w:t>
       </w:r>
       <w:r>
         <w:t xml:space="preserve">2021. “Sounds of Futures Passed: Media Archaeology and Design Fiction as Nime Methodologies.” In </w:t>
@@ -1521,7 +1382,7 @@
       <w:r>
         <w:t>. Shanghai, China. doi:</w:t>
       </w:r>
-      <w:hyperlink r:id="rId8">
+      <w:hyperlink r:id="rId7">
         <w:r>
           <w:rPr>
             <w:rStyle w:val="Hyperlink"/>
@@ -1577,7 +1438,15 @@
           <w:i/>
           <w:iCs/>
         </w:rPr>
-        <w:t>Proceedings of the New Interfaces for Musical Expression (Nime) Conference 2025</w:t>
+        <w:t xml:space="preserve">Proceedings of the New </w:t>
+      </w:r>
+      <w:r>
+        <w:rPr>
+          <w:i/>
+          <w:iCs/>
+        </w:rPr>
+        <w:lastRenderedPageBreak/>
+        <w:t>Interfaces for Musical Expression (Nime) Conference 2025</w:t>
       </w:r>
       <w:r>
         <w:t>. Presented at the New Interfaces for Musical Expression (NIME) conference, Canberra, Australia; NIME.</w:t>
@@ -1630,7 +1499,6 @@
       <w:bookmarkStart w:id="24" w:name="citeproc_bib_item_15"/>
       <w:bookmarkEnd w:id="24"/>
       <w:r>
-        <w:lastRenderedPageBreak/>
         <w:t>Pinch, T</w:t>
       </w:r>
       <w:r>

</xml_diff>